<commit_message>
nev amicus-brief on the shared document model (keyed authorities, the disclosure a numbered page before the tables, certificates as contents headings) and petition-for-rehearing regenerated: cross_engine gate, tier 1 0 failed on typst, latex and docx (fb-595.54.18)
Co-Authored-By: Claude Opus 5.5 <noreply@anthropic.com>
</commit_message>
<xml_diff>
--- a/courts/ninth-circuit/nevada/state/supreme-court/petition-for-rehearing/usage/OUTPUT-petition-for-rehearing.docx
+++ b/courts/ninth-circuit/nevada/state/supreme-court/petition-for-rehearing/usage/OUTPUT-petition-for-rehearing.docx
@@ -1433,7 +1433,7 @@
         <w:pStyle w:val="BodyText"/>
       </w:pPr>
       <w:r>
-        <w:t xml:space="preserve">This Court previously has stated in published opinions that it will only recognize a statutory exception to the NPRA “if the Legislature has expressly and unequivocally created an exemption or exception by statute [. . .]”</w:t>
+        <w:t xml:space="preserve">This Court previously has stated in published opinions that it will only recognize a statutory exception to the NPRA “if the Legislature has expressly and unequivocally created an exemption or exception by statute [. . .]”</w:t>
       </w:r>
       <w:r>
         <w:t xml:space="preserve"> </w:t>
@@ -1446,7 +1446,7 @@
         <w:t xml:space="preserve">Reno Newspapers, Inc. v. Haley</w:t>
       </w:r>
       <w:r>
-        <w:t xml:space="preserve">, 126 Nev. Adv. Rep. 23, 234 P.3d 922, 924 (2010). The Court has also indicated that it will only determine the scope of an exception after it determines that a statute “clearly and unambiguously creates an exception to disclosure of a public record, and provides an affirmative grant of confidentiality [. . .]”</w:t>
+        <w:t xml:space="preserve">, 126 Nev. Adv. Rep. 23, 234 P.3d 922, 924 (2010). The Court has also indicated that it will only determine the scope of an exception after it determines that a statute “clearly and unambiguously creates an exception to disclosure of a public record, and provides an affirmative grant of confidentiality [. . .]”</w:t>
       </w:r>
       <w:r>
         <w:t xml:space="preserve"> </w:t>
@@ -1621,7 +1621,7 @@
         <w:t xml:space="preserve">ACLU of Nev. v. Clark Cty. Sch. Dist.</w:t>
       </w:r>
       <w:r>
-        <w:t xml:space="preserve">, No. 88680, 2026 Nev. LEXIS 23, at *2 (Mar. 26, 2026) ;</w:t>
+        <w:t xml:space="preserve">, No. 88680, 2026 Nev. LEXIS 23, at *2 (Mar. 26, 2026) ;</w:t>
       </w:r>
       <w:r>
         <w:t xml:space="preserve"> </w:t>
@@ -1706,7 +1706,7 @@
         <w:pStyle w:val="BodyText"/>
       </w:pPr>
       <w:r>
-        <w:t xml:space="preserve">NRS 289.080 describes the procedures a law enforcement agency must use if it investigates its officers for misconduct. The Panel has determined that NRS 289.080 creates an exception to the NPRA “[b]ecause NRS 289.080 prevents the officer under investigation from accessing the investigative file unless the investigating agency recommends punitive action [. . .].”</w:t>
+        <w:t xml:space="preserve">NRS 289.080 describes the procedures a law enforcement agency must use if it investigates its officers for misconduct. The Panel has determined that NRS 289.080 creates an exception to the NPRA “[b]ecause NRS 289.080 prevents the officer under investigation from accessing the investigative file unless the investigating agency recommends punitive action [. . .].”</w:t>
       </w:r>
       <w:r>
         <w:t xml:space="preserve"> </w:t>
@@ -2012,7 +2012,7 @@
         <w:pStyle w:val="BodyText"/>
       </w:pPr>
       <w:r>
-        <w:t xml:space="preserve">Rather than following precedent, the Panel’s decision inverts the Court’s NPRA jurisprudence. Instead of citing language that “clearly and unambiguously” creates an exception, the Panel infers that an exception to the NPRA must exist because the Panel believes NRS 289.080(9) “prevents the officer under investigation from accessing the investigative file unless the investigating agency recommends punitive action [. . .]”</w:t>
+        <w:t xml:space="preserve">Rather than following precedent, the Panel’s decision inverts the Court’s NPRA jurisprudence. Instead of citing language that “clearly and unambiguously” creates an exception, the Panel infers that an exception to the NPRA must exist because the Panel believes NRS 289.080(9) “prevents the officer under investigation from accessing the investigative file unless the investigating agency recommends punitive action [. . .]”</w:t>
       </w:r>
       <w:r>
         <w:t xml:space="preserve"> </w:t>
@@ -5669,6 +5669,7 @@
     <w:unhideWhenUsed/>
     <w:qFormat/>
     <w:pPr>
+      <w:keepLines/>
       <w:spacing w:before="0" w:after="140" w:line="322" w:lineRule="exact"/>
     </w:pPr>
     <w:rPr>
@@ -5919,6 +5920,33 @@
     <w:pPr>
       <w:spacing w:before="0" w:after="0" w:line="322" w:lineRule="exact"/>
       <w:ind w:left="2160" w:hanging="720"/>
+    </w:pPr>
+  </w:style>
+  <w:style w:type="paragraph" w:customStyle="1" w:styleId="XdQuoteList1">
+    <w:name w:val="Xd Quote List 1"/>
+    <w:basedOn w:val="Normal"/>
+    <w:qFormat/>
+    <w:pPr>
+      <w:spacing w:before="0" w:after="0" w:line="322" w:lineRule="exact"/>
+      <w:ind w:left="1440" w:right="720" w:hanging="720"/>
+    </w:pPr>
+  </w:style>
+  <w:style w:type="paragraph" w:customStyle="1" w:styleId="XdQuoteList2">
+    <w:name w:val="Xd Quote List 2"/>
+    <w:basedOn w:val="Normal"/>
+    <w:qFormat/>
+    <w:pPr>
+      <w:spacing w:before="0" w:after="0" w:line="322" w:lineRule="exact"/>
+      <w:ind w:left="2160" w:right="720" w:hanging="720"/>
+    </w:pPr>
+  </w:style>
+  <w:style w:type="paragraph" w:customStyle="1" w:styleId="XdQuoteList3">
+    <w:name w:val="Xd Quote List 3"/>
+    <w:basedOn w:val="Normal"/>
+    <w:qFormat/>
+    <w:pPr>
+      <w:spacing w:before="0" w:after="0" w:line="322" w:lineRule="exact"/>
+      <w:ind w:left="2880" w:right="720" w:hanging="720"/>
     </w:pPr>
   </w:style>
   <w:style w:type="paragraph" w:customStyle="1" w:styleId="XdQuoteOnly">

</xml_diff>